<commit_message>
Add 50 words to internship report (total: 15,123 words)
Co-Authored-By: Claude Sonnet 4.6 <noreply@anthropic.com>
Claude-Session: https://claude.ai/code/session_012rfvpjye7Y9QJqspcqPnuk
</commit_message>
<xml_diff>
--- a/Internship_Report_Baseerat_Kamran_BSS_Final.docx
+++ b/Internship_Report_Baseerat_Kamran_BSS_Final.docx
@@ -13751,6 +13751,19 @@
           <w:sz w:val="24"/>
         </w:rPr>
         <w:t xml:space="preserve">The academic year at Beaconhouse follows a three-term structure: Term 1 (August–November), Term 2 (December–March), and Term 3 (April–June). Each term corresponds to a distinct fee collection cycle, examinations schedule, and performance review cycle for academic staff. This structured calendar disciplines the organization's financial planning and enables the Finance department to accurately forecast cash flows, manage expenditure commitments, and ensure that operational resources are aligned with the academic programme delivery requirements at every campus across the network. The alignment of financial and academic cycles is a key feature of Beaconhouse's integrated operational planning framework.</w:t>
+      </w:r>
+    </w:p>
+    <w:p>
+      <w:pPr>
+        <w:jc w:val="both"/>
+        <w:spacing w:before="120" w:after="120" w:line="360" w:lineRule="auto"/>
+      </w:pPr>
+      <w:r>
+        <w:rPr>
+          <w:rFonts w:ascii="Times New Roman" w:hAnsi="Times New Roman"/>
+          <w:sz w:val="24"/>
+        </w:rPr>
+        <w:t xml:space="preserve">Beaconhouse School System's enduring success over five decades is ultimately a reflection of its people — the dedicated teachers, administrators, and support staff who collectively bring the organization's mission to life every day. Their commitment to nurturing young minds and shaping future generations remains the true foundation of Beaconhouse's legacy as Pakistan's most trusted educational institution.</w:t>
       </w:r>
     </w:p>
     <w:p>

</xml_diff>